<commit_message>
Aggreagte functions and Clauses
</commit_message>
<xml_diff>
--- a/Day  - 10.docx
+++ b/Day  - 10.docx
@@ -8,29 +8,18 @@
         <w:rPr>
           <w:b/>
           <w:bCs/>
-          <w:sz w:val="28"/>
-          <w:szCs w:val="28"/>
-        </w:rPr>
-      </w:pPr>
-      <w:proofErr w:type="gramStart"/>
-      <w:r>
-        <w:rPr>
-          <w:b/>
-          <w:bCs/>
-          <w:sz w:val="28"/>
-          <w:szCs w:val="28"/>
-        </w:rPr>
-        <w:t>Day  -</w:t>
-      </w:r>
-      <w:proofErr w:type="gramEnd"/>
-      <w:r>
-        <w:rPr>
-          <w:b/>
-          <w:bCs/>
-          <w:sz w:val="28"/>
-          <w:szCs w:val="28"/>
-        </w:rPr>
-        <w:t xml:space="preserve"> 10</w:t>
+          <w:sz w:val="32"/>
+          <w:szCs w:val="32"/>
+        </w:rPr>
+      </w:pPr>
+      <w:r>
+        <w:rPr>
+          <w:b/>
+          <w:bCs/>
+          <w:sz w:val="32"/>
+          <w:szCs w:val="32"/>
+        </w:rPr>
+        <w:t>Day  - 10</w:t>
       </w:r>
     </w:p>
     <w:p>
@@ -93,39 +82,15 @@
       </w:r>
       <w:r>
         <w:br/>
-        <w:t xml:space="preserve"> name </w:t>
-      </w:r>
-      <w:proofErr w:type="gramStart"/>
-      <w:r>
-        <w:t>VARCHAR(</w:t>
-      </w:r>
-      <w:proofErr w:type="gramEnd"/>
-      <w:r>
-        <w:t>100),</w:t>
-      </w:r>
-      <w:r>
-        <w:br/>
-        <w:t xml:space="preserve"> department </w:t>
-      </w:r>
-      <w:proofErr w:type="gramStart"/>
-      <w:r>
-        <w:t>VARCHAR(</w:t>
-      </w:r>
-      <w:proofErr w:type="gramEnd"/>
-      <w:r>
-        <w:t>30),</w:t>
-      </w:r>
-      <w:r>
-        <w:br/>
-        <w:t xml:space="preserve"> salary </w:t>
-      </w:r>
-      <w:proofErr w:type="gramStart"/>
-      <w:r>
-        <w:t>DECIMAL(</w:t>
-      </w:r>
-      <w:proofErr w:type="gramEnd"/>
-      <w:r>
-        <w:t>10,2)</w:t>
+        <w:t xml:space="preserve"> name VARCHAR(100),</w:t>
+      </w:r>
+      <w:r>
+        <w:br/>
+        <w:t xml:space="preserve"> department VARCHAR(30),</w:t>
+      </w:r>
+      <w:r>
+        <w:br/>
+        <w:t xml:space="preserve"> salary DECIMAL(10,2)</w:t>
       </w:r>
       <w:r>
         <w:br/>
@@ -135,7 +100,7 @@
     <w:p>
       <w:r>
         <w:pict w14:anchorId="27494317">
-          <v:rect id="_x0000_i1343" style="width:0;height:1.5pt" o:hralign="center" o:hrstd="t" o:hr="t" fillcolor="#a0a0a0" stroked="f"/>
+          <v:rect id="_x0000_i1025" style="width:0;height:1.5pt" o:hralign="center" o:hrstd="t" o:hr="t" fillcolor="#a0a0a0" stroked="f"/>
         </w:pict>
       </w:r>
     </w:p>
@@ -202,7 +167,7 @@
     <w:p>
       <w:r>
         <w:pict w14:anchorId="409F8885">
-          <v:rect id="_x0000_i1344" style="width:0;height:1.5pt" o:hralign="center" o:hrstd="t" o:hr="t" fillcolor="#a0a0a0" stroked="f"/>
+          <v:rect id="_x0000_i1026" style="width:0;height:1.5pt" o:hralign="center" o:hrstd="t" o:hr="t" fillcolor="#a0a0a0" stroked="f"/>
         </w:pict>
       </w:r>
     </w:p>
@@ -238,21 +203,8 @@
     </w:p>
     <w:p>
       <w:r>
-        <w:t xml:space="preserve">SELECT </w:t>
-      </w:r>
-      <w:proofErr w:type="gramStart"/>
-      <w:r>
-        <w:t>SUM(</w:t>
-      </w:r>
-      <w:proofErr w:type="gramEnd"/>
-      <w:r>
-        <w:t xml:space="preserve">salary) AS </w:t>
-      </w:r>
-      <w:proofErr w:type="spellStart"/>
-      <w:r>
-        <w:t>Total_Salary</w:t>
-      </w:r>
-      <w:proofErr w:type="spellEnd"/>
+        <w:t>SELECT SUM(salary) AS Total_Salary</w:t>
+      </w:r>
       <w:r>
         <w:br/>
         <w:t xml:space="preserve"> FROM Employee;</w:t>
@@ -261,7 +213,7 @@
     <w:p>
       <w:r>
         <w:pict w14:anchorId="434534E0">
-          <v:rect id="_x0000_i1345" style="width:0;height:1.5pt" o:hralign="center" o:hrstd="t" o:hr="t" fillcolor="#a0a0a0" stroked="f"/>
+          <v:rect id="_x0000_i1027" style="width:0;height:1.5pt" o:hralign="center" o:hrstd="t" o:hr="t" fillcolor="#a0a0a0" stroked="f"/>
         </w:pict>
       </w:r>
     </w:p>
@@ -282,21 +234,8 @@
     </w:p>
     <w:p>
       <w:r>
-        <w:t xml:space="preserve">SELECT </w:t>
-      </w:r>
-      <w:proofErr w:type="gramStart"/>
-      <w:r>
-        <w:t>AVG(</w:t>
-      </w:r>
-      <w:proofErr w:type="gramEnd"/>
-      <w:r>
-        <w:t xml:space="preserve">salary) AS </w:t>
-      </w:r>
-      <w:proofErr w:type="spellStart"/>
-      <w:r>
-        <w:t>Average_Salary</w:t>
-      </w:r>
-      <w:proofErr w:type="spellEnd"/>
+        <w:t>SELECT AVG(salary) AS Average_Salary</w:t>
+      </w:r>
       <w:r>
         <w:br/>
         <w:t xml:space="preserve"> FROM Employee;</w:t>
@@ -305,7 +244,7 @@
     <w:p>
       <w:r>
         <w:pict w14:anchorId="510A580E">
-          <v:rect id="_x0000_i1346" style="width:0;height:1.5pt" o:hralign="center" o:hrstd="t" o:hr="t" fillcolor="#a0a0a0" stroked="f"/>
+          <v:rect id="_x0000_i1028" style="width:0;height:1.5pt" o:hralign="center" o:hrstd="t" o:hr="t" fillcolor="#a0a0a0" stroked="f"/>
         </w:pict>
       </w:r>
     </w:p>
@@ -326,21 +265,8 @@
     </w:p>
     <w:p>
       <w:r>
-        <w:t xml:space="preserve">SELECT </w:t>
-      </w:r>
-      <w:proofErr w:type="gramStart"/>
-      <w:r>
-        <w:t>MAX(</w:t>
-      </w:r>
-      <w:proofErr w:type="gramEnd"/>
-      <w:r>
-        <w:t xml:space="preserve">salary) AS </w:t>
-      </w:r>
-      <w:proofErr w:type="spellStart"/>
-      <w:r>
-        <w:t>Highest_Salary</w:t>
-      </w:r>
-      <w:proofErr w:type="spellEnd"/>
+        <w:t>SELECT MAX(salary) AS Highest_Salary</w:t>
+      </w:r>
       <w:r>
         <w:br/>
         <w:t xml:space="preserve"> FROM Employee;</w:t>
@@ -349,7 +275,7 @@
     <w:p>
       <w:r>
         <w:pict w14:anchorId="14E0F365">
-          <v:rect id="_x0000_i1347" style="width:0;height:1.5pt" o:hralign="center" o:hrstd="t" o:hr="t" fillcolor="#a0a0a0" stroked="f"/>
+          <v:rect id="_x0000_i1029" style="width:0;height:1.5pt" o:hralign="center" o:hrstd="t" o:hr="t" fillcolor="#a0a0a0" stroked="f"/>
         </w:pict>
       </w:r>
     </w:p>
@@ -370,21 +296,8 @@
     </w:p>
     <w:p>
       <w:r>
-        <w:t xml:space="preserve">SELECT </w:t>
-      </w:r>
-      <w:proofErr w:type="gramStart"/>
-      <w:r>
-        <w:t>MIN(</w:t>
-      </w:r>
-      <w:proofErr w:type="gramEnd"/>
-      <w:r>
-        <w:t xml:space="preserve">salary) AS </w:t>
-      </w:r>
-      <w:proofErr w:type="spellStart"/>
-      <w:r>
-        <w:t>Lowest_Salary</w:t>
-      </w:r>
-      <w:proofErr w:type="spellEnd"/>
+        <w:t>SELECT MIN(salary) AS Lowest_Salary</w:t>
+      </w:r>
       <w:r>
         <w:br/>
         <w:t xml:space="preserve"> FROM Employee;</w:t>
@@ -394,7 +307,7 @@
       <w:r>
         <w:lastRenderedPageBreak/>
         <w:pict w14:anchorId="14E62929">
-          <v:rect id="_x0000_i1348" style="width:0;height:1.5pt" o:hralign="center" o:hrstd="t" o:hr="t" fillcolor="#a0a0a0" stroked="f"/>
+          <v:rect id="_x0000_i1030" style="width:0;height:1.5pt" o:hralign="center" o:hrstd="t" o:hr="t" fillcolor="#a0a0a0" stroked="f"/>
         </w:pict>
       </w:r>
     </w:p>
@@ -415,21 +328,8 @@
     </w:p>
     <w:p>
       <w:r>
-        <w:t xml:space="preserve">SELECT </w:t>
-      </w:r>
-      <w:proofErr w:type="gramStart"/>
-      <w:r>
-        <w:t>COUNT(</w:t>
-      </w:r>
-      <w:proofErr w:type="gramEnd"/>
-      <w:r>
-        <w:t xml:space="preserve">*) AS </w:t>
-      </w:r>
-      <w:proofErr w:type="spellStart"/>
-      <w:r>
-        <w:t>Total_Employees</w:t>
-      </w:r>
-      <w:proofErr w:type="spellEnd"/>
+        <w:t>SELECT COUNT(*) AS Total_Employees</w:t>
+      </w:r>
       <w:r>
         <w:br/>
         <w:t xml:space="preserve"> FROM Employee;</w:t>
@@ -438,7 +338,7 @@
     <w:p>
       <w:r>
         <w:pict w14:anchorId="5CC5B799">
-          <v:rect id="_x0000_i1349" style="width:0;height:1.5pt" o:hralign="center" o:hrstd="t" o:hr="t" fillcolor="#a0a0a0" stroked="f"/>
+          <v:rect id="_x0000_i1031" style="width:0;height:1.5pt" o:hralign="center" o:hrstd="t" o:hr="t" fillcolor="#a0a0a0" stroked="f"/>
         </w:pict>
       </w:r>
     </w:p>
@@ -459,21 +359,8 @@
     </w:p>
     <w:p>
       <w:r>
-        <w:t xml:space="preserve">SELECT </w:t>
-      </w:r>
-      <w:proofErr w:type="gramStart"/>
-      <w:r>
-        <w:t>COUNT(</w:t>
-      </w:r>
-      <w:proofErr w:type="gramEnd"/>
-      <w:r>
-        <w:t xml:space="preserve">*) AS </w:t>
-      </w:r>
-      <w:proofErr w:type="spellStart"/>
-      <w:r>
-        <w:t>IT_Employees</w:t>
-      </w:r>
-      <w:proofErr w:type="spellEnd"/>
+        <w:t>SELECT COUNT(*) AS IT_Employees</w:t>
+      </w:r>
       <w:r>
         <w:br/>
         <w:t xml:space="preserve"> FROM Employee</w:t>
@@ -486,7 +373,7 @@
     <w:p>
       <w:r>
         <w:pict w14:anchorId="28216125">
-          <v:rect id="_x0000_i1350" style="width:0;height:1.5pt" o:hralign="center" o:hrstd="t" o:hr="t" fillcolor="#a0a0a0" stroked="f"/>
+          <v:rect id="_x0000_i1032" style="width:0;height:1.5pt" o:hralign="center" o:hrstd="t" o:hr="t" fillcolor="#a0a0a0" stroked="f"/>
         </w:pict>
       </w:r>
     </w:p>
@@ -507,15 +394,7 @@
     </w:p>
     <w:p>
       <w:r>
-        <w:t xml:space="preserve">SELECT </w:t>
-      </w:r>
-      <w:proofErr w:type="gramStart"/>
-      <w:r>
-        <w:t>SUM(</w:t>
-      </w:r>
-      <w:proofErr w:type="gramEnd"/>
-      <w:r>
-        <w:t>salary)</w:t>
+        <w:t>SELECT SUM(salary)</w:t>
       </w:r>
       <w:r>
         <w:br/>
@@ -529,7 +408,7 @@
     <w:p>
       <w:r>
         <w:pict w14:anchorId="239885E2">
-          <v:rect id="_x0000_i1351" style="width:0;height:1.5pt" o:hralign="center" o:hrstd="t" o:hr="t" fillcolor="#a0a0a0" stroked="f"/>
+          <v:rect id="_x0000_i1033" style="width:0;height:1.5pt" o:hralign="center" o:hrstd="t" o:hr="t" fillcolor="#a0a0a0" stroked="f"/>
         </w:pict>
       </w:r>
     </w:p>
@@ -550,15 +429,7 @@
     </w:p>
     <w:p>
       <w:r>
-        <w:t xml:space="preserve">SELECT </w:t>
-      </w:r>
-      <w:proofErr w:type="gramStart"/>
-      <w:r>
-        <w:t>AVG(</w:t>
-      </w:r>
-      <w:proofErr w:type="gramEnd"/>
-      <w:r>
-        <w:t>salary)</w:t>
+        <w:t>SELECT AVG(salary)</w:t>
       </w:r>
       <w:r>
         <w:br/>
@@ -572,7 +443,7 @@
     <w:p>
       <w:r>
         <w:pict w14:anchorId="2D5506D8">
-          <v:rect id="_x0000_i1352" style="width:0;height:1.5pt" o:hralign="center" o:hrstd="t" o:hr="t" fillcolor="#a0a0a0" stroked="f"/>
+          <v:rect id="_x0000_i1034" style="width:0;height:1.5pt" o:hralign="center" o:hrstd="t" o:hr="t" fillcolor="#a0a0a0" stroked="f"/>
         </w:pict>
       </w:r>
     </w:p>
@@ -593,15 +464,7 @@
     </w:p>
     <w:p>
       <w:r>
-        <w:t xml:space="preserve">SELECT </w:t>
-      </w:r>
-      <w:proofErr w:type="gramStart"/>
-      <w:r>
-        <w:t>MAX(</w:t>
-      </w:r>
-      <w:proofErr w:type="gramEnd"/>
-      <w:r>
-        <w:t>salary)</w:t>
+        <w:t>SELECT MAX(salary)</w:t>
       </w:r>
       <w:r>
         <w:br/>
@@ -615,7 +478,7 @@
     <w:p>
       <w:r>
         <w:pict w14:anchorId="31F45AD8">
-          <v:rect id="_x0000_i1353" style="width:0;height:1.5pt" o:hralign="center" o:hrstd="t" o:hr="t" fillcolor="#a0a0a0" stroked="f"/>
+          <v:rect id="_x0000_i1035" style="width:0;height:1.5pt" o:hralign="center" o:hrstd="t" o:hr="t" fillcolor="#a0a0a0" stroked="f"/>
         </w:pict>
       </w:r>
     </w:p>
@@ -636,15 +499,7 @@
     </w:p>
     <w:p>
       <w:r>
-        <w:t xml:space="preserve">SELECT </w:t>
-      </w:r>
-      <w:proofErr w:type="gramStart"/>
-      <w:r>
-        <w:t>MIN(</w:t>
-      </w:r>
-      <w:proofErr w:type="gramEnd"/>
-      <w:r>
-        <w:t>salary)</w:t>
+        <w:t>SELECT MIN(salary)</w:t>
       </w:r>
       <w:r>
         <w:br/>
@@ -658,7 +513,7 @@
     <w:p>
       <w:r>
         <w:pict w14:anchorId="064DEA29">
-          <v:rect id="_x0000_i1354" style="width:0;height:1.5pt" o:hralign="center" o:hrstd="t" o:hr="t" fillcolor="#a0a0a0" stroked="f"/>
+          <v:rect id="_x0000_i1036" style="width:0;height:1.5pt" o:hralign="center" o:hrstd="t" o:hr="t" fillcolor="#a0a0a0" stroked="f"/>
         </w:pict>
       </w:r>
     </w:p>
@@ -679,15 +534,7 @@
     </w:p>
     <w:p>
       <w:r>
-        <w:t xml:space="preserve">SELECT </w:t>
-      </w:r>
-      <w:proofErr w:type="gramStart"/>
-      <w:r>
-        <w:t>COUNT(</w:t>
-      </w:r>
-      <w:proofErr w:type="gramEnd"/>
-      <w:r>
-        <w:t>*)</w:t>
+        <w:t>SELECT COUNT(*)</w:t>
       </w:r>
       <w:r>
         <w:br/>
@@ -701,7 +548,7 @@
     <w:p>
       <w:r>
         <w:pict w14:anchorId="761CEAA0">
-          <v:rect id="_x0000_i1355" style="width:0;height:1.5pt" o:hralign="center" o:hrstd="t" o:hr="t" fillcolor="#a0a0a0" stroked="f"/>
+          <v:rect id="_x0000_i1037" style="width:0;height:1.5pt" o:hralign="center" o:hrstd="t" o:hr="t" fillcolor="#a0a0a0" stroked="f"/>
         </w:pict>
       </w:r>
     </w:p>
@@ -722,15 +569,7 @@
     </w:p>
     <w:p>
       <w:r>
-        <w:t xml:space="preserve">SELECT </w:t>
-      </w:r>
-      <w:proofErr w:type="gramStart"/>
-      <w:r>
-        <w:t>SUM(</w:t>
-      </w:r>
-      <w:proofErr w:type="gramEnd"/>
-      <w:r>
-        <w:t>salary)</w:t>
+        <w:t>SELECT SUM(salary)</w:t>
       </w:r>
       <w:r>
         <w:br/>
@@ -744,7 +583,7 @@
     <w:p>
       <w:r>
         <w:pict w14:anchorId="4E62041F">
-          <v:rect id="_x0000_i1356" style="width:0;height:1.5pt" o:hralign="center" o:hrstd="t" o:hr="t" fillcolor="#a0a0a0" stroked="f"/>
+          <v:rect id="_x0000_i1038" style="width:0;height:1.5pt" o:hralign="center" o:hrstd="t" o:hr="t" fillcolor="#a0a0a0" stroked="f"/>
         </w:pict>
       </w:r>
     </w:p>
@@ -761,48 +600,7 @@
           <w:bCs/>
         </w:rPr>
         <w:lastRenderedPageBreak/>
-        <w:t xml:space="preserve">Difference Between </w:t>
-      </w:r>
-      <w:proofErr w:type="gramStart"/>
-      <w:r>
-        <w:rPr>
-          <w:b/>
-          <w:bCs/>
-        </w:rPr>
-        <w:t>COUNT(</w:t>
-      </w:r>
-      <w:proofErr w:type="gramEnd"/>
-      <w:r>
-        <w:rPr>
-          <w:b/>
-          <w:bCs/>
-        </w:rPr>
-        <w:t xml:space="preserve">*) and </w:t>
-      </w:r>
-      <w:proofErr w:type="gramStart"/>
-      <w:r>
-        <w:rPr>
-          <w:b/>
-          <w:bCs/>
-        </w:rPr>
-        <w:t>COUNT(</w:t>
-      </w:r>
-      <w:proofErr w:type="spellStart"/>
-      <w:proofErr w:type="gramEnd"/>
-      <w:r>
-        <w:rPr>
-          <w:b/>
-          <w:bCs/>
-        </w:rPr>
-        <w:t>column_name</w:t>
-      </w:r>
-      <w:proofErr w:type="spellEnd"/>
-      <w:r>
-        <w:rPr>
-          <w:b/>
-          <w:bCs/>
-        </w:rPr>
-        <w:t>) in MySQL</w:t>
+        <w:t>Difference Between COUNT(*) and COUNT(column_name) in MySQL</w:t>
       </w:r>
     </w:p>
     <w:tbl>
@@ -858,21 +656,12 @@
             <w:hideMark/>
           </w:tcPr>
           <w:p>
-            <w:proofErr w:type="gramStart"/>
             <w:r>
               <w:rPr>
                 <w:b/>
                 <w:bCs/>
               </w:rPr>
-              <w:t>COUNT(</w:t>
-            </w:r>
-            <w:proofErr w:type="gramEnd"/>
-            <w:r>
-              <w:rPr>
-                <w:b/>
-                <w:bCs/>
-              </w:rPr>
-              <w:t>*)</w:t>
+              <w:t>COUNT(*)</w:t>
             </w:r>
           </w:p>
         </w:tc>
@@ -888,30 +677,12 @@
             <w:hideMark/>
           </w:tcPr>
           <w:p>
-            <w:proofErr w:type="gramStart"/>
             <w:r>
               <w:rPr>
                 <w:b/>
                 <w:bCs/>
               </w:rPr>
-              <w:t>COUNT(</w:t>
-            </w:r>
-            <w:proofErr w:type="spellStart"/>
-            <w:proofErr w:type="gramEnd"/>
-            <w:r>
-              <w:rPr>
-                <w:b/>
-                <w:bCs/>
-              </w:rPr>
-              <w:t>column_name</w:t>
-            </w:r>
-            <w:proofErr w:type="spellEnd"/>
-            <w:r>
-              <w:rPr>
-                <w:b/>
-                <w:bCs/>
-              </w:rPr>
-              <w:t>)</w:t>
+              <w:t>COUNT(column_name)</w:t>
             </w:r>
           </w:p>
         </w:tc>
@@ -1228,23 +999,7 @@
           <w:b/>
           <w:bCs/>
         </w:rPr>
-        <w:t>filter records based on specified conditions where clauses can be used as comparison operators, logical operators and</w:t>
-      </w:r>
-      <w:proofErr w:type="gramStart"/>
-      <w:r>
-        <w:rPr>
-          <w:b/>
-          <w:bCs/>
-        </w:rPr>
-        <w:t xml:space="preserve"> ..</w:t>
-      </w:r>
-      <w:proofErr w:type="gramEnd"/>
-      <w:r>
-        <w:rPr>
-          <w:b/>
-          <w:bCs/>
-        </w:rPr>
-        <w:t>etc operators.</w:t>
+        <w:t>filter records based on specified conditions where clauses can be used as comparison operators, logical operators and ..etc operators.</w:t>
       </w:r>
     </w:p>
     <w:p/>
@@ -1272,23 +1027,7 @@
           <w:b/>
           <w:bCs/>
         </w:rPr>
-        <w:t>select column</w:t>
-      </w:r>
-      <w:proofErr w:type="gramStart"/>
-      <w:r>
-        <w:rPr>
-          <w:b/>
-          <w:bCs/>
-        </w:rPr>
-        <w:t>1,column</w:t>
-      </w:r>
-      <w:proofErr w:type="gramEnd"/>
-      <w:r>
-        <w:rPr>
-          <w:b/>
-          <w:bCs/>
-        </w:rPr>
-        <w:t>2....</w:t>
+        <w:t>select column1,column2....</w:t>
       </w:r>
     </w:p>
     <w:p>
@@ -1334,80 +1073,7 @@
           <w:b/>
           <w:bCs/>
         </w:rPr>
-        <w:t>The group by clause is used to group rows having the same values in one or more columns. It is commonly used with aggregate functions such as sum(</w:t>
-      </w:r>
-      <w:proofErr w:type="gramStart"/>
-      <w:r>
-        <w:rPr>
-          <w:b/>
-          <w:bCs/>
-        </w:rPr>
-        <w:t>),min</w:t>
-      </w:r>
-      <w:proofErr w:type="gramEnd"/>
-      <w:r>
-        <w:rPr>
-          <w:b/>
-          <w:bCs/>
-        </w:rPr>
-        <w:t>(</w:t>
-      </w:r>
-      <w:proofErr w:type="gramStart"/>
-      <w:r>
-        <w:rPr>
-          <w:b/>
-          <w:bCs/>
-        </w:rPr>
-        <w:t>),max</w:t>
-      </w:r>
-      <w:proofErr w:type="gramEnd"/>
-      <w:r>
-        <w:rPr>
-          <w:b/>
-          <w:bCs/>
-        </w:rPr>
-        <w:t>(</w:t>
-      </w:r>
-      <w:proofErr w:type="gramStart"/>
-      <w:r>
-        <w:rPr>
-          <w:b/>
-          <w:bCs/>
-        </w:rPr>
-        <w:t>),</w:t>
-      </w:r>
-      <w:proofErr w:type="spellStart"/>
-      <w:r>
-        <w:rPr>
-          <w:b/>
-          <w:bCs/>
-        </w:rPr>
-        <w:t>avg</w:t>
-      </w:r>
-      <w:proofErr w:type="spellEnd"/>
-      <w:proofErr w:type="gramEnd"/>
-      <w:r>
-        <w:rPr>
-          <w:b/>
-          <w:bCs/>
-        </w:rPr>
-        <w:t>(</w:t>
-      </w:r>
-      <w:proofErr w:type="gramStart"/>
-      <w:r>
-        <w:rPr>
-          <w:b/>
-          <w:bCs/>
-        </w:rPr>
-        <w:t>),count</w:t>
-      </w:r>
-      <w:proofErr w:type="gramEnd"/>
-      <w:r>
-        <w:rPr>
-          <w:b/>
-          <w:bCs/>
-        </w:rPr>
-        <w:t>().</w:t>
+        <w:t>The group by clause is used to group rows having the same values in one or more columns. It is commonly used with aggregate functions such as sum(),min(),max(),avg(),count().</w:t>
       </w:r>
     </w:p>
     <w:p/>
@@ -1436,32 +1102,7 @@
           <w:bCs/>
         </w:rPr>
         <w:lastRenderedPageBreak/>
-        <w:t>select column-</w:t>
-      </w:r>
-      <w:proofErr w:type="spellStart"/>
-      <w:proofErr w:type="gramStart"/>
-      <w:r>
-        <w:rPr>
-          <w:b/>
-          <w:bCs/>
-        </w:rPr>
-        <w:t>name,aggregate</w:t>
-      </w:r>
-      <w:proofErr w:type="gramEnd"/>
-      <w:r>
-        <w:rPr>
-          <w:b/>
-          <w:bCs/>
-        </w:rPr>
-        <w:t>_function</w:t>
-      </w:r>
-      <w:proofErr w:type="spellEnd"/>
-      <w:r>
-        <w:rPr>
-          <w:b/>
-          <w:bCs/>
-        </w:rPr>
-        <w:t>(column-name)</w:t>
+        <w:t>select column-name,aggregate_function(column-name)</w:t>
       </w:r>
     </w:p>
     <w:p>
@@ -1479,23 +1120,7 @@
           <w:b/>
           <w:bCs/>
         </w:rPr>
-        <w:t xml:space="preserve">group by </w:t>
-      </w:r>
-      <w:proofErr w:type="spellStart"/>
-      <w:r>
-        <w:rPr>
-          <w:b/>
-          <w:bCs/>
-        </w:rPr>
-        <w:t>column_name</w:t>
-      </w:r>
-      <w:proofErr w:type="spellEnd"/>
-      <w:r>
-        <w:rPr>
-          <w:b/>
-          <w:bCs/>
-        </w:rPr>
-        <w:t>.</w:t>
+        <w:t>group by column_name.</w:t>
       </w:r>
     </w:p>
     <w:p/>
@@ -1555,21 +1180,12 @@
       </w:r>
     </w:p>
     <w:p>
-      <w:proofErr w:type="spellStart"/>
-      <w:r>
-        <w:rPr>
-          <w:b/>
-          <w:bCs/>
-        </w:rPr>
-        <w:t>aggregate_function</w:t>
-      </w:r>
-      <w:proofErr w:type="spellEnd"/>
-      <w:r>
-        <w:rPr>
-          <w:b/>
-          <w:bCs/>
-        </w:rPr>
-        <w:t>(column-name)</w:t>
+      <w:r>
+        <w:rPr>
+          <w:b/>
+          <w:bCs/>
+        </w:rPr>
+        <w:t>aggregate_function(column-name)</w:t>
       </w:r>
     </w:p>
     <w:p>
@@ -1624,84 +1240,25 @@
           <w:b/>
           <w:bCs/>
         </w:rPr>
-        <w:t xml:space="preserve">the order by clause is used to sort the result set in </w:t>
-      </w:r>
-      <w:proofErr w:type="gramStart"/>
-      <w:r>
-        <w:rPr>
-          <w:b/>
-          <w:bCs/>
-        </w:rPr>
-        <w:t>ascending(</w:t>
-      </w:r>
-      <w:proofErr w:type="gramEnd"/>
-      <w:r>
-        <w:rPr>
-          <w:b/>
-          <w:bCs/>
-        </w:rPr>
-        <w:t xml:space="preserve">ASC)or </w:t>
-      </w:r>
-      <w:proofErr w:type="gramStart"/>
-      <w:r>
-        <w:rPr>
-          <w:b/>
-          <w:bCs/>
-        </w:rPr>
-        <w:t>descending(</w:t>
-      </w:r>
-      <w:proofErr w:type="spellStart"/>
-      <w:proofErr w:type="gramEnd"/>
-      <w:r>
-        <w:rPr>
-          <w:b/>
-          <w:bCs/>
-        </w:rPr>
-        <w:t>Desc</w:t>
-      </w:r>
-      <w:proofErr w:type="spellEnd"/>
-      <w:r>
-        <w:rPr>
-          <w:b/>
-          <w:bCs/>
-        </w:rPr>
-        <w:t>)order.</w:t>
-      </w:r>
-    </w:p>
-    <w:p>
-      <w:proofErr w:type="spellStart"/>
-      <w:r>
-        <w:rPr>
-          <w:b/>
-          <w:bCs/>
-        </w:rPr>
-        <w:t>asc</w:t>
-      </w:r>
-      <w:proofErr w:type="spellEnd"/>
-      <w:r>
-        <w:rPr>
-          <w:b/>
-          <w:bCs/>
-        </w:rPr>
-        <w:t>--&gt;Ascending order by default.</w:t>
-      </w:r>
-    </w:p>
-    <w:p>
-      <w:proofErr w:type="spellStart"/>
-      <w:r>
-        <w:rPr>
-          <w:b/>
-          <w:bCs/>
-        </w:rPr>
-        <w:t>Desc</w:t>
-      </w:r>
-      <w:proofErr w:type="spellEnd"/>
-      <w:r>
-        <w:rPr>
-          <w:b/>
-          <w:bCs/>
-        </w:rPr>
-        <w:t>--&gt;Descending order</w:t>
+        <w:t>the order by clause is used to sort the result set in ascending(ASC)or descending(Desc)order.</w:t>
+      </w:r>
+    </w:p>
+    <w:p>
+      <w:r>
+        <w:rPr>
+          <w:b/>
+          <w:bCs/>
+        </w:rPr>
+        <w:t>asc--&gt;Ascending order by default.</w:t>
+      </w:r>
+    </w:p>
+    <w:p>
+      <w:r>
+        <w:rPr>
+          <w:b/>
+          <w:bCs/>
+        </w:rPr>
+        <w:t>Desc--&gt;Descending order</w:t>
       </w:r>
     </w:p>
     <w:p/>
@@ -1747,23 +1304,7 @@
           <w:b/>
           <w:bCs/>
         </w:rPr>
-        <w:t xml:space="preserve">order by column-name </w:t>
-      </w:r>
-      <w:proofErr w:type="spellStart"/>
-      <w:r>
-        <w:rPr>
-          <w:b/>
-          <w:bCs/>
-        </w:rPr>
-        <w:t>asc</w:t>
-      </w:r>
-      <w:proofErr w:type="spellEnd"/>
-      <w:r>
-        <w:rPr>
-          <w:b/>
-          <w:bCs/>
-        </w:rPr>
-        <w:t>;</w:t>
+        <w:t>order by column-name asc;</w:t>
       </w:r>
     </w:p>
     <w:p>
@@ -1809,48 +1350,16 @@
           <w:b/>
           <w:bCs/>
         </w:rPr>
-        <w:t>    </w:t>
-      </w:r>
-      <w:proofErr w:type="spellStart"/>
-      <w:r>
-        <w:rPr>
-          <w:b/>
-          <w:bCs/>
-        </w:rPr>
-        <w:t>StudentID</w:t>
-      </w:r>
-      <w:proofErr w:type="spellEnd"/>
-      <w:r>
-        <w:rPr>
-          <w:b/>
-          <w:bCs/>
-        </w:rPr>
-        <w:t xml:space="preserve"> INT AUTO_INCREMENT PRIMARY KEY,</w:t>
-      </w:r>
-    </w:p>
-    <w:p>
-      <w:r>
-        <w:rPr>
-          <w:b/>
-          <w:bCs/>
-        </w:rPr>
-        <w:t xml:space="preserve">    Name </w:t>
-      </w:r>
-      <w:proofErr w:type="gramStart"/>
-      <w:r>
-        <w:rPr>
-          <w:b/>
-          <w:bCs/>
-        </w:rPr>
-        <w:t>VARCHAR(</w:t>
-      </w:r>
-      <w:proofErr w:type="gramEnd"/>
-      <w:r>
-        <w:rPr>
-          <w:b/>
-          <w:bCs/>
-        </w:rPr>
-        <w:t>50),</w:t>
+        <w:t>    StudentID INT AUTO_INCREMENT PRIMARY KEY,</w:t>
+      </w:r>
+    </w:p>
+    <w:p>
+      <w:r>
+        <w:rPr>
+          <w:b/>
+          <w:bCs/>
+        </w:rPr>
+        <w:t>    Name VARCHAR(50),</w:t>
       </w:r>
     </w:p>
     <w:p>
@@ -1869,23 +1378,7 @@
           <w:b/>
           <w:bCs/>
         </w:rPr>
-        <w:t xml:space="preserve">    Department </w:t>
-      </w:r>
-      <w:proofErr w:type="gramStart"/>
-      <w:r>
-        <w:rPr>
-          <w:b/>
-          <w:bCs/>
-        </w:rPr>
-        <w:t>VARCHAR(</w:t>
-      </w:r>
-      <w:proofErr w:type="gramEnd"/>
-      <w:r>
-        <w:rPr>
-          <w:b/>
-          <w:bCs/>
-        </w:rPr>
-        <w:t>30),</w:t>
+        <w:t>    Department VARCHAR(30),</w:t>
       </w:r>
     </w:p>
     <w:p>
@@ -1903,23 +1396,7 @@
           <w:b/>
           <w:bCs/>
         </w:rPr>
-        <w:t xml:space="preserve">    City </w:t>
-      </w:r>
-      <w:proofErr w:type="gramStart"/>
-      <w:r>
-        <w:rPr>
-          <w:b/>
-          <w:bCs/>
-        </w:rPr>
-        <w:t>VARCHAR(</w:t>
-      </w:r>
-      <w:proofErr w:type="gramEnd"/>
-      <w:r>
-        <w:rPr>
-          <w:b/>
-          <w:bCs/>
-        </w:rPr>
-        <w:t>30)</w:t>
+        <w:t>    City VARCHAR(30)</w:t>
       </w:r>
     </w:p>
     <w:p>
@@ -2118,7 +1595,7 @@
     <w:p>
       <w:r>
         <w:pict w14:anchorId="2144E6D1">
-          <v:rect id="_x0000_i1357" style="width:0;height:1.5pt" o:hralign="center" o:hrstd="t" o:hr="t" fillcolor="#a0a0a0" stroked="f"/>
+          <v:rect id="_x0000_i1039" style="width:0;height:1.5pt" o:hralign="center" o:hrstd="t" o:hr="t" fillcolor="#a0a0a0" stroked="f"/>
         </w:pict>
       </w:r>
     </w:p>
@@ -2183,7 +1660,7 @@
     <w:p>
       <w:r>
         <w:pict w14:anchorId="6B579353">
-          <v:rect id="_x0000_i1358" style="width:0;height:1.5pt" o:hralign="center" o:hrstd="t" o:hr="t" fillcolor="#a0a0a0" stroked="f"/>
+          <v:rect id="_x0000_i1040" style="width:0;height:1.5pt" o:hralign="center" o:hrstd="t" o:hr="t" fillcolor="#a0a0a0" stroked="f"/>
         </w:pict>
       </w:r>
     </w:p>
@@ -2249,7 +1726,7 @@
     <w:p>
       <w:r>
         <w:pict w14:anchorId="19BBC839">
-          <v:rect id="_x0000_i1359" style="width:0;height:1.5pt" o:hralign="center" o:hrstd="t" o:hr="t" fillcolor="#a0a0a0" stroked="f"/>
+          <v:rect id="_x0000_i1041" style="width:0;height:1.5pt" o:hralign="center" o:hrstd="t" o:hr="t" fillcolor="#a0a0a0" stroked="f"/>
         </w:pict>
       </w:r>
     </w:p>
@@ -2314,7 +1791,7 @@
     <w:p>
       <w:r>
         <w:pict w14:anchorId="53FCE9EE">
-          <v:rect id="_x0000_i1360" style="width:0;height:1.5pt" o:hralign="center" o:hrstd="t" o:hr="t" fillcolor="#a0a0a0" stroked="f"/>
+          <v:rect id="_x0000_i1042" style="width:0;height:1.5pt" o:hralign="center" o:hrstd="t" o:hr="t" fillcolor="#a0a0a0" stroked="f"/>
         </w:pict>
       </w:r>
     </w:p>
@@ -2379,7 +1856,7 @@
     <w:p>
       <w:r>
         <w:pict w14:anchorId="28A72448">
-          <v:rect id="_x0000_i1361" style="width:0;height:1.5pt" o:hralign="center" o:hrstd="t" o:hr="t" fillcolor="#a0a0a0" stroked="f"/>
+          <v:rect id="_x0000_i1043" style="width:0;height:1.5pt" o:hralign="center" o:hrstd="t" o:hr="t" fillcolor="#a0a0a0" stroked="f"/>
         </w:pict>
       </w:r>
     </w:p>
@@ -2437,33 +1914,8 @@
           <w:b/>
           <w:bCs/>
         </w:rPr>
-        <w:t xml:space="preserve">SELECT Department, </w:t>
-      </w:r>
-      <w:proofErr w:type="gramStart"/>
-      <w:r>
-        <w:rPr>
-          <w:b/>
-          <w:bCs/>
-        </w:rPr>
-        <w:t>COUNT(</w:t>
-      </w:r>
-      <w:proofErr w:type="gramEnd"/>
-      <w:r>
-        <w:rPr>
-          <w:b/>
-          <w:bCs/>
-        </w:rPr>
-        <w:t xml:space="preserve">*) AS </w:t>
-      </w:r>
-      <w:proofErr w:type="spellStart"/>
-      <w:r>
-        <w:rPr>
-          <w:b/>
-          <w:bCs/>
-        </w:rPr>
-        <w:t>Total_Students</w:t>
-      </w:r>
-      <w:proofErr w:type="spellEnd"/>
+        <w:t>SELECT Department, COUNT(*) AS Total_Students</w:t>
+      </w:r>
       <w:r>
         <w:rPr>
           <w:b/>
@@ -2484,7 +1936,7 @@
     <w:p>
       <w:r>
         <w:pict w14:anchorId="2F27A950">
-          <v:rect id="_x0000_i1362" style="width:0;height:1.5pt" o:hralign="center" o:hrstd="t" o:hr="t" fillcolor="#a0a0a0" stroked="f"/>
+          <v:rect id="_x0000_i1044" style="width:0;height:1.5pt" o:hralign="center" o:hrstd="t" o:hr="t" fillcolor="#a0a0a0" stroked="f"/>
         </w:pict>
       </w:r>
     </w:p>
@@ -2527,17 +1979,8 @@
           <w:b/>
           <w:bCs/>
         </w:rPr>
-        <w:t xml:space="preserve">SELECT Department, AVG(Marks) AS </w:t>
-      </w:r>
-      <w:proofErr w:type="spellStart"/>
-      <w:r>
-        <w:rPr>
-          <w:b/>
-          <w:bCs/>
-        </w:rPr>
-        <w:t>Average_Marks</w:t>
-      </w:r>
-      <w:proofErr w:type="spellEnd"/>
+        <w:t>SELECT Department, AVG(Marks) AS Average_Marks</w:t>
+      </w:r>
       <w:r>
         <w:rPr>
           <w:b/>
@@ -2558,7 +2001,7 @@
     <w:p>
       <w:r>
         <w:pict w14:anchorId="1F971CA9">
-          <v:rect id="_x0000_i1363" style="width:0;height:1.5pt" o:hralign="center" o:hrstd="t" o:hr="t" fillcolor="#a0a0a0" stroked="f"/>
+          <v:rect id="_x0000_i1045" style="width:0;height:1.5pt" o:hralign="center" o:hrstd="t" o:hr="t" fillcolor="#a0a0a0" stroked="f"/>
         </w:pict>
       </w:r>
     </w:p>
@@ -2602,17 +2045,8 @@
           <w:bCs/>
         </w:rPr>
         <w:lastRenderedPageBreak/>
-        <w:t xml:space="preserve">SELECT Department, MAX(Marks) AS </w:t>
-      </w:r>
-      <w:proofErr w:type="spellStart"/>
-      <w:r>
-        <w:rPr>
-          <w:b/>
-          <w:bCs/>
-        </w:rPr>
-        <w:t>Highest_Marks</w:t>
-      </w:r>
-      <w:proofErr w:type="spellEnd"/>
+        <w:t>SELECT Department, MAX(Marks) AS Highest_Marks</w:t>
+      </w:r>
       <w:r>
         <w:rPr>
           <w:b/>
@@ -2633,7 +2067,7 @@
     <w:p>
       <w:r>
         <w:pict w14:anchorId="03333486">
-          <v:rect id="_x0000_i1364" style="width:0;height:1.5pt" o:hralign="center" o:hrstd="t" o:hr="t" fillcolor="#a0a0a0" stroked="f"/>
+          <v:rect id="_x0000_i1046" style="width:0;height:1.5pt" o:hralign="center" o:hrstd="t" o:hr="t" fillcolor="#a0a0a0" stroked="f"/>
         </w:pict>
       </w:r>
     </w:p>
@@ -2676,17 +2110,8 @@
           <w:b/>
           <w:bCs/>
         </w:rPr>
-        <w:t xml:space="preserve">SELECT Department, MIN(Marks) AS </w:t>
-      </w:r>
-      <w:proofErr w:type="spellStart"/>
-      <w:r>
-        <w:rPr>
-          <w:b/>
-          <w:bCs/>
-        </w:rPr>
-        <w:t>Lowest_Marks</w:t>
-      </w:r>
-      <w:proofErr w:type="spellEnd"/>
+        <w:t>SELECT Department, MIN(Marks) AS Lowest_Marks</w:t>
+      </w:r>
       <w:r>
         <w:rPr>
           <w:b/>
@@ -2707,7 +2132,7 @@
     <w:p>
       <w:r>
         <w:pict w14:anchorId="5E72A3D6">
-          <v:rect id="_x0000_i1365" style="width:0;height:1.5pt" o:hralign="center" o:hrstd="t" o:hr="t" fillcolor="#a0a0a0" stroked="f"/>
+          <v:rect id="_x0000_i1047" style="width:0;height:1.5pt" o:hralign="center" o:hrstd="t" o:hr="t" fillcolor="#a0a0a0" stroked="f"/>
         </w:pict>
       </w:r>
     </w:p>
@@ -2750,17 +2175,8 @@
           <w:b/>
           <w:bCs/>
         </w:rPr>
-        <w:t xml:space="preserve">SELECT Department, SUM(Marks) AS </w:t>
-      </w:r>
-      <w:proofErr w:type="spellStart"/>
-      <w:r>
-        <w:rPr>
-          <w:b/>
-          <w:bCs/>
-        </w:rPr>
-        <w:t>Total_Marks</w:t>
-      </w:r>
-      <w:proofErr w:type="spellEnd"/>
+        <w:t>SELECT Department, SUM(Marks) AS Total_Marks</w:t>
+      </w:r>
       <w:r>
         <w:rPr>
           <w:b/>
@@ -2781,14 +2197,14 @@
     <w:p>
       <w:r>
         <w:pict w14:anchorId="6F043A8F">
-          <v:rect id="_x0000_i1366" style="width:0;height:1.5pt" o:hralign="center" o:hrstd="t" o:hr="t" fillcolor="#a0a0a0" stroked="f"/>
+          <v:rect id="_x0000_i1048" style="width:0;height:1.5pt" o:hralign="center" o:hrstd="t" o:hr="t" fillcolor="#a0a0a0" stroked="f"/>
         </w:pict>
       </w:r>
     </w:p>
     <w:p>
       <w:r>
         <w:pict w14:anchorId="10476D6C">
-          <v:rect id="_x0000_i1367" style="width:0;height:1.5pt" o:hralign="center" o:hrstd="t" o:hr="t" fillcolor="#a0a0a0" stroked="f"/>
+          <v:rect id="_x0000_i1049" style="width:0;height:1.5pt" o:hralign="center" o:hrstd="t" o:hr="t" fillcolor="#a0a0a0" stroked="f"/>
         </w:pict>
       </w:r>
     </w:p>
@@ -2846,17 +2262,8 @@
           <w:b/>
           <w:bCs/>
         </w:rPr>
-        <w:t xml:space="preserve">SELECT Department, </w:t>
-      </w:r>
-      <w:proofErr w:type="gramStart"/>
-      <w:r>
-        <w:rPr>
-          <w:b/>
-          <w:bCs/>
-        </w:rPr>
-        <w:t>COUNT(</w:t>
-      </w:r>
-      <w:proofErr w:type="gramEnd"/>
+        <w:t>SELECT Department, COUNT(</w:t>
+      </w:r>
       <w:r>
         <w:rPr>
           <w:b/>
@@ -2864,9 +2271,8 @@
           <w:i/>
           <w:iCs/>
         </w:rPr>
-        <w:t xml:space="preserve">) AS </w:t>
-      </w:r>
-      <w:proofErr w:type="spellStart"/>
+        <w:t>) AS Total_Students</w:t>
+      </w:r>
       <w:r>
         <w:rPr>
           <w:b/>
@@ -2874,9 +2280,9 @@
           <w:i/>
           <w:iCs/>
         </w:rPr>
-        <w:t>Total_Students</w:t>
-      </w:r>
-      <w:proofErr w:type="spellEnd"/>
+        <w:br/>
+        <w:t xml:space="preserve"> FROM students</w:t>
+      </w:r>
       <w:r>
         <w:rPr>
           <w:b/>
@@ -2885,7 +2291,7 @@
           <w:iCs/>
         </w:rPr>
         <w:br/>
-        <w:t xml:space="preserve"> FROM students</w:t>
+        <w:t xml:space="preserve"> GROUP BY Department</w:t>
       </w:r>
       <w:r>
         <w:rPr>
@@ -2895,7 +2301,137 @@
           <w:iCs/>
         </w:rPr>
         <w:br/>
+        <w:t xml:space="preserve"> HAVING COUNT(</w:t>
+      </w:r>
+      <w:r>
+        <w:rPr>
+          <w:b/>
+          <w:bCs/>
+        </w:rPr>
+        <w:t>) &gt; 2;</w:t>
+      </w:r>
+    </w:p>
+    <w:p>
+      <w:r>
+        <w:pict w14:anchorId="1F3D8A40">
+          <v:rect id="_x0000_i1050" style="width:0;height:1.5pt" o:hralign="center" o:hrstd="t" o:hr="t" fillcolor="#a0a0a0" stroked="f"/>
+        </w:pict>
+      </w:r>
+    </w:p>
+    <w:p>
+      <w:pPr>
+        <w:rPr>
+          <w:b/>
+          <w:bCs/>
+        </w:rPr>
+      </w:pPr>
+      <w:r>
+        <w:rPr>
+          <w:b/>
+          <w:bCs/>
+        </w:rPr>
+        <w:t>Question 2</w:t>
+      </w:r>
+    </w:p>
+    <w:p>
+      <w:r>
+        <w:rPr>
+          <w:b/>
+          <w:bCs/>
+        </w:rPr>
+        <w:t>Display departments whose average marks are greater than 75.</w:t>
+      </w:r>
+    </w:p>
+    <w:p>
+      <w:r>
+        <w:rPr>
+          <w:b/>
+          <w:bCs/>
+        </w:rPr>
+        <w:t>Query</w:t>
+      </w:r>
+    </w:p>
+    <w:p>
+      <w:r>
+        <w:rPr>
+          <w:b/>
+          <w:bCs/>
+        </w:rPr>
+        <w:t>SELECT Department, AVG(Marks) AS Average_Marks</w:t>
+      </w:r>
+      <w:r>
+        <w:rPr>
+          <w:b/>
+          <w:bCs/>
+        </w:rPr>
+        <w:br/>
+        <w:t xml:space="preserve"> FROM students</w:t>
+      </w:r>
+      <w:r>
+        <w:rPr>
+          <w:b/>
+          <w:bCs/>
+        </w:rPr>
+        <w:br/>
         <w:t xml:space="preserve"> GROUP BY Department</w:t>
+      </w:r>
+      <w:r>
+        <w:rPr>
+          <w:b/>
+          <w:bCs/>
+        </w:rPr>
+        <w:br/>
+        <w:t xml:space="preserve"> HAVING AVG(Marks) &gt; 75;</w:t>
+      </w:r>
+    </w:p>
+    <w:p>
+      <w:r>
+        <w:pict w14:anchorId="16ED6DB4">
+          <v:rect id="_x0000_i1051" style="width:0;height:1.5pt" o:hralign="center" o:hrstd="t" o:hr="t" fillcolor="#a0a0a0" stroked="f"/>
+        </w:pict>
+      </w:r>
+    </w:p>
+    <w:p>
+      <w:pPr>
+        <w:rPr>
+          <w:b/>
+          <w:bCs/>
+        </w:rPr>
+      </w:pPr>
+      <w:r>
+        <w:rPr>
+          <w:b/>
+          <w:bCs/>
+        </w:rPr>
+        <w:t>Question 3</w:t>
+      </w:r>
+    </w:p>
+    <w:p>
+      <w:r>
+        <w:rPr>
+          <w:b/>
+          <w:bCs/>
+        </w:rPr>
+        <w:t>Display cities having more than one student.</w:t>
+      </w:r>
+    </w:p>
+    <w:p>
+      <w:r>
+        <w:rPr>
+          <w:b/>
+          <w:bCs/>
+        </w:rPr>
+        <w:t>Query</w:t>
+      </w:r>
+    </w:p>
+    <w:p>
+      <w:r>
+        <w:rPr>
+          <w:b/>
+          <w:bCs/>
+        </w:rPr>
+        <w:lastRenderedPageBreak/>
+        <w:t>SELECT City, COUNT(</w:t>
       </w:r>
       <w:r>
         <w:rPr>
@@ -2904,10 +2440,8 @@
           <w:i/>
           <w:iCs/>
         </w:rPr>
-        <w:br/>
-        <w:t xml:space="preserve"> HAVING </w:t>
-      </w:r>
-      <w:proofErr w:type="gramStart"/>
+        <w:t>) AS Total_Students</w:t>
+      </w:r>
       <w:r>
         <w:rPr>
           <w:b/>
@@ -2915,157 +2449,9 @@
           <w:i/>
           <w:iCs/>
         </w:rPr>
-        <w:t>COUNT(</w:t>
-      </w:r>
-      <w:proofErr w:type="gramEnd"/>
-      <w:r>
-        <w:rPr>
-          <w:b/>
-          <w:bCs/>
-        </w:rPr>
-        <w:t>) &gt; 2;</w:t>
-      </w:r>
-    </w:p>
-    <w:p>
-      <w:r>
-        <w:pict w14:anchorId="1F3D8A40">
-          <v:rect id="_x0000_i1368" style="width:0;height:1.5pt" o:hralign="center" o:hrstd="t" o:hr="t" fillcolor="#a0a0a0" stroked="f"/>
-        </w:pict>
-      </w:r>
-    </w:p>
-    <w:p>
-      <w:pPr>
-        <w:rPr>
-          <w:b/>
-          <w:bCs/>
-        </w:rPr>
-      </w:pPr>
-      <w:r>
-        <w:rPr>
-          <w:b/>
-          <w:bCs/>
-        </w:rPr>
-        <w:t>Question 2</w:t>
-      </w:r>
-    </w:p>
-    <w:p>
-      <w:r>
-        <w:rPr>
-          <w:b/>
-          <w:bCs/>
-        </w:rPr>
-        <w:t>Display departments whose average marks are greater than 75.</w:t>
-      </w:r>
-    </w:p>
-    <w:p>
-      <w:r>
-        <w:rPr>
-          <w:b/>
-          <w:bCs/>
-        </w:rPr>
-        <w:t>Query</w:t>
-      </w:r>
-    </w:p>
-    <w:p>
-      <w:r>
-        <w:rPr>
-          <w:b/>
-          <w:bCs/>
-        </w:rPr>
-        <w:t xml:space="preserve">SELECT Department, AVG(Marks) AS </w:t>
-      </w:r>
-      <w:proofErr w:type="spellStart"/>
-      <w:r>
-        <w:rPr>
-          <w:b/>
-          <w:bCs/>
-        </w:rPr>
-        <w:t>Average_Marks</w:t>
-      </w:r>
-      <w:proofErr w:type="spellEnd"/>
-      <w:r>
-        <w:rPr>
-          <w:b/>
-          <w:bCs/>
-        </w:rPr>
         <w:br/>
         <w:t xml:space="preserve"> FROM students</w:t>
       </w:r>
-      <w:r>
-        <w:rPr>
-          <w:b/>
-          <w:bCs/>
-        </w:rPr>
-        <w:br/>
-        <w:t xml:space="preserve"> GROUP BY Department</w:t>
-      </w:r>
-      <w:r>
-        <w:rPr>
-          <w:b/>
-          <w:bCs/>
-        </w:rPr>
-        <w:br/>
-        <w:t xml:space="preserve"> HAVING AVG(Marks) &gt; 75;</w:t>
-      </w:r>
-    </w:p>
-    <w:p>
-      <w:r>
-        <w:pict w14:anchorId="16ED6DB4">
-          <v:rect id="_x0000_i1369" style="width:0;height:1.5pt" o:hralign="center" o:hrstd="t" o:hr="t" fillcolor="#a0a0a0" stroked="f"/>
-        </w:pict>
-      </w:r>
-    </w:p>
-    <w:p>
-      <w:pPr>
-        <w:rPr>
-          <w:b/>
-          <w:bCs/>
-        </w:rPr>
-      </w:pPr>
-      <w:r>
-        <w:rPr>
-          <w:b/>
-          <w:bCs/>
-        </w:rPr>
-        <w:t>Question 3</w:t>
-      </w:r>
-    </w:p>
-    <w:p>
-      <w:r>
-        <w:rPr>
-          <w:b/>
-          <w:bCs/>
-        </w:rPr>
-        <w:t>Display cities having more than one student.</w:t>
-      </w:r>
-    </w:p>
-    <w:p>
-      <w:r>
-        <w:rPr>
-          <w:b/>
-          <w:bCs/>
-        </w:rPr>
-        <w:t>Query</w:t>
-      </w:r>
-    </w:p>
-    <w:p>
-      <w:r>
-        <w:rPr>
-          <w:b/>
-          <w:bCs/>
-        </w:rPr>
-        <w:lastRenderedPageBreak/>
-        <w:t xml:space="preserve">SELECT City, </w:t>
-      </w:r>
-      <w:proofErr w:type="gramStart"/>
-      <w:r>
-        <w:rPr>
-          <w:b/>
-          <w:bCs/>
-        </w:rPr>
-        <w:t>COUNT(</w:t>
-      </w:r>
-      <w:proofErr w:type="gramEnd"/>
       <w:r>
         <w:rPr>
           <w:b/>
@@ -3073,9 +2459,9 @@
           <w:i/>
           <w:iCs/>
         </w:rPr>
-        <w:t xml:space="preserve">) AS </w:t>
-      </w:r>
-      <w:proofErr w:type="spellStart"/>
+        <w:br/>
+        <w:t xml:space="preserve"> GROUP BY City</w:t>
+      </w:r>
       <w:r>
         <w:rPr>
           <w:b/>
@@ -3083,9 +2469,138 @@
           <w:i/>
           <w:iCs/>
         </w:rPr>
-        <w:t>Total_Students</w:t>
-      </w:r>
-      <w:proofErr w:type="spellEnd"/>
+        <w:br/>
+        <w:t xml:space="preserve"> HAVING COUNT(</w:t>
+      </w:r>
+      <w:r>
+        <w:rPr>
+          <w:b/>
+          <w:bCs/>
+        </w:rPr>
+        <w:t>) &gt; 1;</w:t>
+      </w:r>
+    </w:p>
+    <w:p>
+      <w:r>
+        <w:pict w14:anchorId="2D964B90">
+          <v:rect id="_x0000_i1052" style="width:0;height:1.5pt" o:hralign="center" o:hrstd="t" o:hr="t" fillcolor="#a0a0a0" stroked="f"/>
+        </w:pict>
+      </w:r>
+    </w:p>
+    <w:p>
+      <w:pPr>
+        <w:rPr>
+          <w:b/>
+          <w:bCs/>
+        </w:rPr>
+      </w:pPr>
+      <w:r>
+        <w:rPr>
+          <w:b/>
+          <w:bCs/>
+        </w:rPr>
+        <w:t>Question 4</w:t>
+      </w:r>
+    </w:p>
+    <w:p>
+      <w:r>
+        <w:rPr>
+          <w:b/>
+          <w:bCs/>
+        </w:rPr>
+        <w:t>Display departments whose total marks are greater than 150.</w:t>
+      </w:r>
+    </w:p>
+    <w:p>
+      <w:r>
+        <w:rPr>
+          <w:b/>
+          <w:bCs/>
+        </w:rPr>
+        <w:t>Query</w:t>
+      </w:r>
+    </w:p>
+    <w:p>
+      <w:r>
+        <w:rPr>
+          <w:b/>
+          <w:bCs/>
+        </w:rPr>
+        <w:t>SELECT Department, SUM(Marks) AS Total_Marks</w:t>
+      </w:r>
+      <w:r>
+        <w:rPr>
+          <w:b/>
+          <w:bCs/>
+        </w:rPr>
+        <w:br/>
+        <w:t xml:space="preserve"> FROM students</w:t>
+      </w:r>
+      <w:r>
+        <w:rPr>
+          <w:b/>
+          <w:bCs/>
+        </w:rPr>
+        <w:br/>
+        <w:t xml:space="preserve"> GROUP BY Department</w:t>
+      </w:r>
+      <w:r>
+        <w:rPr>
+          <w:b/>
+          <w:bCs/>
+        </w:rPr>
+        <w:br/>
+        <w:t xml:space="preserve"> HAVING SUM(Marks) &gt; 150;</w:t>
+      </w:r>
+    </w:p>
+    <w:p>
+      <w:r>
+        <w:pict w14:anchorId="79DD9D7D">
+          <v:rect id="_x0000_i1053" style="width:0;height:1.5pt" o:hralign="center" o:hrstd="t" o:hr="t" fillcolor="#a0a0a0" stroked="f"/>
+        </w:pict>
+      </w:r>
+    </w:p>
+    <w:p>
+      <w:pPr>
+        <w:rPr>
+          <w:b/>
+          <w:bCs/>
+        </w:rPr>
+      </w:pPr>
+      <w:r>
+        <w:rPr>
+          <w:b/>
+          <w:bCs/>
+        </w:rPr>
+        <w:t>Question 5</w:t>
+      </w:r>
+    </w:p>
+    <w:p>
+      <w:r>
+        <w:rPr>
+          <w:b/>
+          <w:bCs/>
+        </w:rPr>
+        <w:t>Display age groups having more than two students.</w:t>
+      </w:r>
+    </w:p>
+    <w:p>
+      <w:r>
+        <w:rPr>
+          <w:b/>
+          <w:bCs/>
+        </w:rPr>
+        <w:t>Query</w:t>
+      </w:r>
+    </w:p>
+    <w:p>
+      <w:r>
+        <w:rPr>
+          <w:b/>
+          <w:bCs/>
+        </w:rPr>
+        <w:t>SELECT Age, COUNT(</w:t>
+      </w:r>
       <w:r>
         <w:rPr>
           <w:b/>
@@ -3093,8 +2608,7 @@
           <w:i/>
           <w:iCs/>
         </w:rPr>
-        <w:br/>
-        <w:t xml:space="preserve"> FROM students</w:t>
+        <w:t>) AS Total_Students</w:t>
       </w:r>
       <w:r>
         <w:rPr>
@@ -3104,7 +2618,7 @@
           <w:iCs/>
         </w:rPr>
         <w:br/>
-        <w:t xml:space="preserve"> GROUP BY City</w:t>
+        <w:t xml:space="preserve"> FROM students</w:t>
       </w:r>
       <w:r>
         <w:rPr>
@@ -3114,9 +2628,8 @@
           <w:iCs/>
         </w:rPr>
         <w:br/>
-        <w:t xml:space="preserve"> HAVING </w:t>
-      </w:r>
-      <w:proofErr w:type="gramStart"/>
+        <w:t xml:space="preserve"> GROUP BY Age</w:t>
+      </w:r>
       <w:r>
         <w:rPr>
           <w:b/>
@@ -3124,46 +2637,68 @@
           <w:i/>
           <w:iCs/>
         </w:rPr>
-        <w:t>COUNT(</w:t>
-      </w:r>
-      <w:proofErr w:type="gramEnd"/>
-      <w:r>
-        <w:rPr>
-          <w:b/>
-          <w:bCs/>
-        </w:rPr>
-        <w:t>) &gt; 1;</w:t>
-      </w:r>
-    </w:p>
-    <w:p>
-      <w:r>
-        <w:pict w14:anchorId="2D964B90">
-          <v:rect id="_x0000_i1370" style="width:0;height:1.5pt" o:hralign="center" o:hrstd="t" o:hr="t" fillcolor="#a0a0a0" stroked="f"/>
+        <w:br/>
+        <w:t xml:space="preserve"> HAVING COUNT(</w:t>
+      </w:r>
+      <w:r>
+        <w:rPr>
+          <w:b/>
+          <w:bCs/>
+        </w:rPr>
+        <w:t>) &gt; 2;</w:t>
+      </w:r>
+    </w:p>
+    <w:p>
+      <w:r>
+        <w:pict w14:anchorId="45EFBDDE">
+          <v:rect id="_x0000_i1054" style="width:0;height:1.5pt" o:hralign="center" o:hrstd="t" o:hr="t" fillcolor="#a0a0a0" stroked="f"/>
         </w:pict>
       </w:r>
     </w:p>
     <w:p>
-      <w:pPr>
-        <w:rPr>
-          <w:b/>
-          <w:bCs/>
-        </w:rPr>
-      </w:pPr>
-      <w:r>
-        <w:rPr>
-          <w:b/>
-          <w:bCs/>
-        </w:rPr>
-        <w:t>Question 4</w:t>
-      </w:r>
-    </w:p>
-    <w:p>
-      <w:r>
-        <w:rPr>
-          <w:b/>
-          <w:bCs/>
-        </w:rPr>
-        <w:t>Display departments whose total marks are greater than 150.</w:t>
+      <w:r>
+        <w:pict w14:anchorId="1953D86D">
+          <v:rect id="_x0000_i1055" style="width:0;height:1.5pt" o:hralign="center" o:hrstd="t" o:hr="t" fillcolor="#a0a0a0" stroked="f"/>
+        </w:pict>
+      </w:r>
+    </w:p>
+    <w:p>
+      <w:pPr>
+        <w:rPr>
+          <w:b/>
+          <w:bCs/>
+        </w:rPr>
+      </w:pPr>
+      <w:r>
+        <w:rPr>
+          <w:b/>
+          <w:bCs/>
+        </w:rPr>
+        <w:t>ORDER BY Clause </w:t>
+      </w:r>
+    </w:p>
+    <w:p>
+      <w:pPr>
+        <w:rPr>
+          <w:b/>
+          <w:bCs/>
+        </w:rPr>
+      </w:pPr>
+      <w:r>
+        <w:rPr>
+          <w:b/>
+          <w:bCs/>
+        </w:rPr>
+        <w:t>Question 1</w:t>
+      </w:r>
+    </w:p>
+    <w:p>
+      <w:r>
+        <w:rPr>
+          <w:b/>
+          <w:bCs/>
+        </w:rPr>
+        <w:t>Display all students ordered by name.</w:t>
       </w:r>
     </w:p>
     <w:p>
@@ -3181,17 +2716,8 @@
           <w:b/>
           <w:bCs/>
         </w:rPr>
-        <w:t xml:space="preserve">SELECT Department, SUM(Marks) AS </w:t>
-      </w:r>
-      <w:proofErr w:type="spellStart"/>
-      <w:r>
-        <w:rPr>
-          <w:b/>
-          <w:bCs/>
-        </w:rPr>
-        <w:t>Total_Marks</w:t>
-      </w:r>
-      <w:proofErr w:type="spellEnd"/>
+        <w:t>SELECT *</w:t>
+      </w:r>
       <w:r>
         <w:rPr>
           <w:b/>
@@ -3206,21 +2732,13 @@
           <w:bCs/>
         </w:rPr>
         <w:br/>
-        <w:t xml:space="preserve"> GROUP BY Department</w:t>
-      </w:r>
-      <w:r>
-        <w:rPr>
-          <w:b/>
-          <w:bCs/>
-        </w:rPr>
-        <w:br/>
-        <w:t xml:space="preserve"> HAVING SUM(Marks) &gt; 150;</w:t>
-      </w:r>
-    </w:p>
-    <w:p>
-      <w:r>
-        <w:pict w14:anchorId="79DD9D7D">
-          <v:rect id="_x0000_i1371" style="width:0;height:1.5pt" o:hralign="center" o:hrstd="t" o:hr="t" fillcolor="#a0a0a0" stroked="f"/>
+        <w:t xml:space="preserve"> ORDER BY Name;</w:t>
+      </w:r>
+    </w:p>
+    <w:p>
+      <w:r>
+        <w:pict w14:anchorId="40A27ADB">
+          <v:rect id="_x0000_i1056" style="width:0;height:1.5pt" o:hralign="center" o:hrstd="t" o:hr="t" fillcolor="#a0a0a0" stroked="f"/>
         </w:pict>
       </w:r>
     </w:p>
@@ -3236,16 +2754,16 @@
           <w:b/>
           <w:bCs/>
         </w:rPr>
-        <w:t>Question 5</w:t>
-      </w:r>
-    </w:p>
-    <w:p>
-      <w:r>
-        <w:rPr>
-          <w:b/>
-          <w:bCs/>
-        </w:rPr>
-        <w:t>Display age groups having more than two students.</w:t>
+        <w:t>Question 2</w:t>
+      </w:r>
+    </w:p>
+    <w:p>
+      <w:r>
+        <w:rPr>
+          <w:b/>
+          <w:bCs/>
+        </w:rPr>
+        <w:t>Display all students ordered by marks in descending order.</w:t>
       </w:r>
     </w:p>
     <w:p>
@@ -3263,43 +2781,12 @@
           <w:b/>
           <w:bCs/>
         </w:rPr>
-        <w:t xml:space="preserve">SELECT Age, </w:t>
-      </w:r>
-      <w:proofErr w:type="gramStart"/>
-      <w:r>
-        <w:rPr>
-          <w:b/>
-          <w:bCs/>
-        </w:rPr>
-        <w:t>COUNT(</w:t>
-      </w:r>
-      <w:proofErr w:type="gramEnd"/>
-      <w:r>
-        <w:rPr>
-          <w:b/>
-          <w:bCs/>
-          <w:i/>
-          <w:iCs/>
-        </w:rPr>
-        <w:t xml:space="preserve">) AS </w:t>
-      </w:r>
-      <w:proofErr w:type="spellStart"/>
-      <w:r>
-        <w:rPr>
-          <w:b/>
-          <w:bCs/>
-          <w:i/>
-          <w:iCs/>
-        </w:rPr>
-        <w:t>Total_Students</w:t>
-      </w:r>
-      <w:proofErr w:type="spellEnd"/>
-      <w:r>
-        <w:rPr>
-          <w:b/>
-          <w:bCs/>
-          <w:i/>
-          <w:iCs/>
+        <w:t>SELECT *</w:t>
+      </w:r>
+      <w:r>
+        <w:rPr>
+          <w:b/>
+          <w:bCs/>
         </w:rPr>
         <w:br/>
         <w:t xml:space="preserve"> FROM students</w:t>
@@ -3308,188 +2795,6 @@
         <w:rPr>
           <w:b/>
           <w:bCs/>
-          <w:i/>
-          <w:iCs/>
-        </w:rPr>
-        <w:br/>
-        <w:t xml:space="preserve"> GROUP BY Age</w:t>
-      </w:r>
-      <w:r>
-        <w:rPr>
-          <w:b/>
-          <w:bCs/>
-          <w:i/>
-          <w:iCs/>
-        </w:rPr>
-        <w:br/>
-        <w:t xml:space="preserve"> HAVING </w:t>
-      </w:r>
-      <w:proofErr w:type="gramStart"/>
-      <w:r>
-        <w:rPr>
-          <w:b/>
-          <w:bCs/>
-          <w:i/>
-          <w:iCs/>
-        </w:rPr>
-        <w:t>COUNT(</w:t>
-      </w:r>
-      <w:proofErr w:type="gramEnd"/>
-      <w:r>
-        <w:rPr>
-          <w:b/>
-          <w:bCs/>
-        </w:rPr>
-        <w:t>) &gt; 2;</w:t>
-      </w:r>
-    </w:p>
-    <w:p>
-      <w:r>
-        <w:pict w14:anchorId="45EFBDDE">
-          <v:rect id="_x0000_i1372" style="width:0;height:1.5pt" o:hralign="center" o:hrstd="t" o:hr="t" fillcolor="#a0a0a0" stroked="f"/>
-        </w:pict>
-      </w:r>
-    </w:p>
-    <w:p>
-      <w:r>
-        <w:pict w14:anchorId="1953D86D">
-          <v:rect id="_x0000_i1373" style="width:0;height:1.5pt" o:hralign="center" o:hrstd="t" o:hr="t" fillcolor="#a0a0a0" stroked="f"/>
-        </w:pict>
-      </w:r>
-    </w:p>
-    <w:p>
-      <w:pPr>
-        <w:rPr>
-          <w:b/>
-          <w:bCs/>
-        </w:rPr>
-      </w:pPr>
-      <w:r>
-        <w:rPr>
-          <w:b/>
-          <w:bCs/>
-        </w:rPr>
-        <w:t>ORDER BY Clause </w:t>
-      </w:r>
-    </w:p>
-    <w:p>
-      <w:pPr>
-        <w:rPr>
-          <w:b/>
-          <w:bCs/>
-        </w:rPr>
-      </w:pPr>
-      <w:r>
-        <w:rPr>
-          <w:b/>
-          <w:bCs/>
-        </w:rPr>
-        <w:t>Question 1</w:t>
-      </w:r>
-    </w:p>
-    <w:p>
-      <w:r>
-        <w:rPr>
-          <w:b/>
-          <w:bCs/>
-        </w:rPr>
-        <w:t>Display all students ordered by name.</w:t>
-      </w:r>
-    </w:p>
-    <w:p>
-      <w:r>
-        <w:rPr>
-          <w:b/>
-          <w:bCs/>
-        </w:rPr>
-        <w:t>Query</w:t>
-      </w:r>
-    </w:p>
-    <w:p>
-      <w:r>
-        <w:rPr>
-          <w:b/>
-          <w:bCs/>
-        </w:rPr>
-        <w:t>SELECT *</w:t>
-      </w:r>
-      <w:r>
-        <w:rPr>
-          <w:b/>
-          <w:bCs/>
-        </w:rPr>
-        <w:br/>
-        <w:t xml:space="preserve"> FROM students</w:t>
-      </w:r>
-      <w:r>
-        <w:rPr>
-          <w:b/>
-          <w:bCs/>
-        </w:rPr>
-        <w:br/>
-        <w:t xml:space="preserve"> ORDER BY Name;</w:t>
-      </w:r>
-    </w:p>
-    <w:p>
-      <w:r>
-        <w:pict w14:anchorId="40A27ADB">
-          <v:rect id="_x0000_i1374" style="width:0;height:1.5pt" o:hralign="center" o:hrstd="t" o:hr="t" fillcolor="#a0a0a0" stroked="f"/>
-        </w:pict>
-      </w:r>
-    </w:p>
-    <w:p>
-      <w:pPr>
-        <w:rPr>
-          <w:b/>
-          <w:bCs/>
-        </w:rPr>
-      </w:pPr>
-      <w:r>
-        <w:rPr>
-          <w:b/>
-          <w:bCs/>
-        </w:rPr>
-        <w:t>Question 2</w:t>
-      </w:r>
-    </w:p>
-    <w:p>
-      <w:r>
-        <w:rPr>
-          <w:b/>
-          <w:bCs/>
-        </w:rPr>
-        <w:t>Display all students ordered by marks in descending order.</w:t>
-      </w:r>
-    </w:p>
-    <w:p>
-      <w:r>
-        <w:rPr>
-          <w:b/>
-          <w:bCs/>
-        </w:rPr>
-        <w:t>Query</w:t>
-      </w:r>
-    </w:p>
-    <w:p>
-      <w:r>
-        <w:rPr>
-          <w:b/>
-          <w:bCs/>
-        </w:rPr>
-        <w:t>SELECT *</w:t>
-      </w:r>
-      <w:r>
-        <w:rPr>
-          <w:b/>
-          <w:bCs/>
-        </w:rPr>
-        <w:br/>
-        <w:t xml:space="preserve"> FROM students</w:t>
-      </w:r>
-      <w:r>
-        <w:rPr>
-          <w:b/>
-          <w:bCs/>
         </w:rPr>
         <w:br/>
         <w:t xml:space="preserve"> ORDER BY Marks DESC;</w:t>
@@ -3498,7 +2803,7 @@
     <w:p>
       <w:r>
         <w:pict w14:anchorId="344FF24F">
-          <v:rect id="_x0000_i1375" style="width:0;height:1.5pt" o:hralign="center" o:hrstd="t" o:hr="t" fillcolor="#a0a0a0" stroked="f"/>
+          <v:rect id="_x0000_i1057" style="width:0;height:1.5pt" o:hralign="center" o:hrstd="t" o:hr="t" fillcolor="#a0a0a0" stroked="f"/>
         </w:pict>
       </w:r>
     </w:p>
@@ -3564,7 +2869,7 @@
     <w:p>
       <w:r>
         <w:pict w14:anchorId="7A0F96DD">
-          <v:rect id="_x0000_i1376" style="width:0;height:1.5pt" o:hralign="center" o:hrstd="t" o:hr="t" fillcolor="#a0a0a0" stroked="f"/>
+          <v:rect id="_x0000_i1058" style="width:0;height:1.5pt" o:hralign="center" o:hrstd="t" o:hr="t" fillcolor="#a0a0a0" stroked="f"/>
         </w:pict>
       </w:r>
     </w:p>
@@ -3629,7 +2934,7 @@
     <w:p>
       <w:r>
         <w:pict w14:anchorId="431B9824">
-          <v:rect id="_x0000_i1377" style="width:0;height:1.5pt" o:hralign="center" o:hrstd="t" o:hr="t" fillcolor="#a0a0a0" stroked="f"/>
+          <v:rect id="_x0000_i1059" style="width:0;height:1.5pt" o:hralign="center" o:hrstd="t" o:hr="t" fillcolor="#a0a0a0" stroked="f"/>
         </w:pict>
       </w:r>
     </w:p>
@@ -3694,7 +2999,7 @@
     <w:p>
       <w:r>
         <w:pict w14:anchorId="14A880A9">
-          <v:rect id="_x0000_i1378" style="width:0;height:1.5pt" o:hralign="center" o:hrstd="t" o:hr="t" fillcolor="#a0a0a0" stroked="f"/>
+          <v:rect id="_x0000_i1060" style="width:0;height:1.5pt" o:hralign="center" o:hrstd="t" o:hr="t" fillcolor="#a0a0a0" stroked="f"/>
         </w:pict>
       </w:r>
     </w:p>
@@ -3702,7 +3007,7 @@
     <w:p>
       <w:r>
         <w:pict w14:anchorId="1F5C963C">
-          <v:rect id="_x0000_i1379" style="width:0;height:1.5pt" o:hralign="center" o:hrstd="t" o:hr="t" fillcolor="#a0a0a0" stroked="f"/>
+          <v:rect id="_x0000_i1061" style="width:0;height:1.5pt" o:hralign="center" o:hrstd="t" o:hr="t" fillcolor="#a0a0a0" stroked="f"/>
         </w:pict>
       </w:r>
     </w:p>
@@ -3766,7 +3071,6 @@
           <w:bCs/>
         </w:rPr>
       </w:pPr>
-      <w:proofErr w:type="gramStart"/>
       <w:r>
         <w:rPr>
           <w:b/>
@@ -3774,7 +3078,6 @@
         </w:rPr>
         <w:t>WHERE</w:t>
       </w:r>
-      <w:proofErr w:type="gramEnd"/>
     </w:p>
     <w:p>
       <w:pPr>
@@ -3855,7 +3158,7 @@
     <w:p>
       <w:r>
         <w:pict w14:anchorId="3DFC302C">
-          <v:rect id="_x0000_i1380" style="width:0;height:1.5pt" o:hralign="center" o:hrstd="t" o:hr="t" fillcolor="#a0a0a0" stroked="f"/>
+          <v:rect id="_x0000_i1062" style="width:0;height:1.5pt" o:hralign="center" o:hrstd="t" o:hr="t" fillcolor="#a0a0a0" stroked="f"/>
         </w:pict>
       </w:r>
     </w:p>
@@ -3906,17 +3209,8 @@
           <w:bCs/>
         </w:rPr>
         <w:br/>
-        <w:t xml:space="preserve"> AVG(Marks) AS </w:t>
-      </w:r>
-      <w:proofErr w:type="spellStart"/>
-      <w:r>
-        <w:rPr>
-          <w:b/>
-          <w:bCs/>
-        </w:rPr>
-        <w:t>Average_Marks</w:t>
-      </w:r>
-      <w:proofErr w:type="spellEnd"/>
+        <w:t xml:space="preserve"> AVG(Marks) AS Average_Marks</w:t>
+      </w:r>
       <w:r>
         <w:rPr>
           <w:b/>
@@ -3962,29 +3256,13 @@
           <w:bCs/>
         </w:rPr>
         <w:br/>
-        <w:t xml:space="preserve"> ORDER BY </w:t>
-      </w:r>
-      <w:proofErr w:type="spellStart"/>
-      <w:r>
-        <w:rPr>
-          <w:b/>
-          <w:bCs/>
-        </w:rPr>
-        <w:t>Average_Marks</w:t>
-      </w:r>
-      <w:proofErr w:type="spellEnd"/>
-      <w:r>
-        <w:rPr>
-          <w:b/>
-          <w:bCs/>
-        </w:rPr>
-        <w:t xml:space="preserve"> DESC;</w:t>
+        <w:t xml:space="preserve"> ORDER BY Average_Marks DESC;</w:t>
       </w:r>
     </w:p>
     <w:p>
       <w:r>
         <w:pict w14:anchorId="0ED0E08E">
-          <v:rect id="_x0000_i1381" style="width:0;height:1.5pt" o:hralign="center" o:hrstd="t" o:hr="t" fillcolor="#a0a0a0" stroked="f"/>
+          <v:rect id="_x0000_i1063" style="width:0;height:1.5pt" o:hralign="center" o:hrstd="t" o:hr="t" fillcolor="#a0a0a0" stroked="f"/>
         </w:pict>
       </w:r>
     </w:p>
@@ -4035,17 +3313,8 @@
           <w:bCs/>
         </w:rPr>
         <w:br/>
-        <w:t xml:space="preserve"> </w:t>
-      </w:r>
-      <w:proofErr w:type="gramStart"/>
-      <w:r>
-        <w:rPr>
-          <w:b/>
-          <w:bCs/>
-        </w:rPr>
-        <w:t>COUNT(</w:t>
-      </w:r>
-      <w:proofErr w:type="gramEnd"/>
+        <w:t xml:space="preserve"> COUNT(</w:t>
+      </w:r>
       <w:r>
         <w:rPr>
           <w:b/>
@@ -4053,9 +3322,8 @@
           <w:i/>
           <w:iCs/>
         </w:rPr>
-        <w:t xml:space="preserve">) AS </w:t>
-      </w:r>
-      <w:proofErr w:type="spellStart"/>
+        <w:t>) AS Total_Students</w:t>
+      </w:r>
       <w:r>
         <w:rPr>
           <w:b/>
@@ -4063,9 +3331,9 @@
           <w:i/>
           <w:iCs/>
         </w:rPr>
-        <w:t>Total_Students</w:t>
-      </w:r>
-      <w:proofErr w:type="spellEnd"/>
+        <w:br/>
+        <w:t xml:space="preserve"> FROM students</w:t>
+      </w:r>
       <w:r>
         <w:rPr>
           <w:b/>
@@ -4074,7 +3342,7 @@
           <w:iCs/>
         </w:rPr>
         <w:br/>
-        <w:t xml:space="preserve"> FROM students</w:t>
+        <w:t xml:space="preserve"> WHERE Marks &gt; 70</w:t>
       </w:r>
       <w:r>
         <w:rPr>
@@ -4084,7 +3352,7 @@
           <w:iCs/>
         </w:rPr>
         <w:br/>
-        <w:t xml:space="preserve"> WHERE Marks &gt; 70</w:t>
+        <w:t xml:space="preserve"> GROUP BY City</w:t>
       </w:r>
       <w:r>
         <w:rPr>
@@ -4094,29 +3362,8 @@
           <w:iCs/>
         </w:rPr>
         <w:br/>
-        <w:t xml:space="preserve"> GROUP BY City</w:t>
-      </w:r>
-      <w:r>
-        <w:rPr>
-          <w:b/>
-          <w:bCs/>
-          <w:i/>
-          <w:iCs/>
-        </w:rPr>
-        <w:br/>
-        <w:t xml:space="preserve"> HAVING </w:t>
-      </w:r>
-      <w:proofErr w:type="gramStart"/>
-      <w:r>
-        <w:rPr>
-          <w:b/>
-          <w:bCs/>
-          <w:i/>
-          <w:iCs/>
-        </w:rPr>
-        <w:t>COUNT(</w:t>
-      </w:r>
-      <w:proofErr w:type="gramEnd"/>
+        <w:t xml:space="preserve"> HAVING COUNT(</w:t>
+      </w:r>
       <w:r>
         <w:rPr>
           <w:b/>
@@ -4130,29 +3377,13 @@
           <w:bCs/>
         </w:rPr>
         <w:br/>
-        <w:t xml:space="preserve"> ORDER BY </w:t>
-      </w:r>
-      <w:proofErr w:type="spellStart"/>
-      <w:r>
-        <w:rPr>
-          <w:b/>
-          <w:bCs/>
-        </w:rPr>
-        <w:t>Total_Students</w:t>
-      </w:r>
-      <w:proofErr w:type="spellEnd"/>
-      <w:r>
-        <w:rPr>
-          <w:b/>
-          <w:bCs/>
-        </w:rPr>
-        <w:t xml:space="preserve"> DESC;</w:t>
+        <w:t xml:space="preserve"> ORDER BY Total_Students DESC;</w:t>
       </w:r>
     </w:p>
     <w:p>
       <w:r>
         <w:pict w14:anchorId="7E434F85">
-          <v:rect id="_x0000_i1382" style="width:0;height:1.5pt" o:hralign="center" o:hrstd="t" o:hr="t" fillcolor="#a0a0a0" stroked="f"/>
+          <v:rect id="_x0000_i1064" style="width:0;height:1.5pt" o:hralign="center" o:hrstd="t" o:hr="t" fillcolor="#a0a0a0" stroked="f"/>
         </w:pict>
       </w:r>
     </w:p>
@@ -4203,17 +3434,8 @@
           <w:bCs/>
         </w:rPr>
         <w:br/>
-        <w:t xml:space="preserve"> SUM(Marks) AS </w:t>
-      </w:r>
-      <w:proofErr w:type="spellStart"/>
-      <w:r>
-        <w:rPr>
-          <w:b/>
-          <w:bCs/>
-        </w:rPr>
-        <w:t>Total_Marks</w:t>
-      </w:r>
-      <w:proofErr w:type="spellEnd"/>
+        <w:t xml:space="preserve"> SUM(Marks) AS Total_Marks</w:t>
+      </w:r>
       <w:r>
         <w:rPr>
           <w:b/>
@@ -4228,23 +3450,7 @@
           <w:bCs/>
         </w:rPr>
         <w:br/>
-        <w:t xml:space="preserve"> WHERE City IN ('</w:t>
-      </w:r>
-      <w:proofErr w:type="spellStart"/>
-      <w:r>
-        <w:rPr>
-          <w:b/>
-          <w:bCs/>
-        </w:rPr>
-        <w:t>Hyderabad','Pune</w:t>
-      </w:r>
-      <w:proofErr w:type="spellEnd"/>
-      <w:r>
-        <w:rPr>
-          <w:b/>
-          <w:bCs/>
-        </w:rPr>
-        <w:t>')</w:t>
+        <w:t xml:space="preserve"> WHERE City IN ('Hyderabad','Pune')</w:t>
       </w:r>
       <w:r>
         <w:rPr>
@@ -4268,29 +3474,13 @@
           <w:bCs/>
         </w:rPr>
         <w:br/>
-        <w:t xml:space="preserve"> ORDER BY </w:t>
-      </w:r>
-      <w:proofErr w:type="spellStart"/>
-      <w:r>
-        <w:rPr>
-          <w:b/>
-          <w:bCs/>
-        </w:rPr>
-        <w:t>Total_Marks</w:t>
-      </w:r>
-      <w:proofErr w:type="spellEnd"/>
-      <w:r>
-        <w:rPr>
-          <w:b/>
-          <w:bCs/>
-        </w:rPr>
-        <w:t xml:space="preserve"> DESC;</w:t>
+        <w:t xml:space="preserve"> ORDER BY Total_Marks DESC;</w:t>
       </w:r>
     </w:p>
     <w:p>
       <w:r>
         <w:pict w14:anchorId="774E9A66">
-          <v:rect id="_x0000_i1383" style="width:0;height:1.5pt" o:hralign="center" o:hrstd="t" o:hr="t" fillcolor="#a0a0a0" stroked="f"/>
+          <v:rect id="_x0000_i1065" style="width:0;height:1.5pt" o:hralign="center" o:hrstd="t" o:hr="t" fillcolor="#a0a0a0" stroked="f"/>
         </w:pict>
       </w:r>
     </w:p>
@@ -4341,7 +3531,7 @@
     <w:p>
       <w:r>
         <w:pict w14:anchorId="1D862947">
-          <v:rect id="_x0000_i1384" style="width:0;height:1.5pt" o:hralign="center" o:hrstd="t" o:hr="t" fillcolor="#a0a0a0" stroked="f"/>
+          <v:rect id="_x0000_i1066" style="width:0;height:1.5pt" o:hralign="center" o:hrstd="t" o:hr="t" fillcolor="#a0a0a0" stroked="f"/>
         </w:pict>
       </w:r>
     </w:p>
@@ -4362,21 +3552,13 @@
     </w:p>
     <w:p>
       <w:r>
-        <w:t xml:space="preserve">SELECT </w:t>
-      </w:r>
-      <w:proofErr w:type="gramStart"/>
-      <w:r>
-        <w:t>CURDATE(</w:t>
-      </w:r>
-      <w:proofErr w:type="gramEnd"/>
-      <w:r>
-        <w:t>);</w:t>
+        <w:t>SELECT CURDATE();</w:t>
       </w:r>
     </w:p>
     <w:p>
       <w:r>
         <w:pict w14:anchorId="3EEA43C3">
-          <v:rect id="_x0000_i1385" style="width:0;height:1.5pt" o:hralign="center" o:hrstd="t" o:hr="t" fillcolor="#a0a0a0" stroked="f"/>
+          <v:rect id="_x0000_i1067" style="width:0;height:1.5pt" o:hralign="center" o:hrstd="t" o:hr="t" fillcolor="#a0a0a0" stroked="f"/>
         </w:pict>
       </w:r>
     </w:p>
@@ -4397,22 +3579,14 @@
     </w:p>
     <w:p>
       <w:r>
-        <w:t xml:space="preserve">SELECT </w:t>
-      </w:r>
-      <w:proofErr w:type="gramStart"/>
-      <w:r>
-        <w:t>CURTIME(</w:t>
-      </w:r>
-      <w:proofErr w:type="gramEnd"/>
-      <w:r>
-        <w:t>);</w:t>
+        <w:t>SELECT CURTIME();</w:t>
       </w:r>
     </w:p>
     <w:p>
       <w:r>
         <w:lastRenderedPageBreak/>
         <w:pict w14:anchorId="3C3667CE">
-          <v:rect id="_x0000_i1386" style="width:0;height:1.5pt" o:hralign="center" o:hrstd="t" o:hr="t" fillcolor="#a0a0a0" stroked="f"/>
+          <v:rect id="_x0000_i1068" style="width:0;height:1.5pt" o:hralign="center" o:hrstd="t" o:hr="t" fillcolor="#a0a0a0" stroked="f"/>
         </w:pict>
       </w:r>
     </w:p>
@@ -4433,21 +3607,13 @@
     </w:p>
     <w:p>
       <w:r>
-        <w:t xml:space="preserve">SELECT </w:t>
-      </w:r>
-      <w:proofErr w:type="gramStart"/>
-      <w:r>
-        <w:t>NOW(</w:t>
-      </w:r>
-      <w:proofErr w:type="gramEnd"/>
-      <w:r>
-        <w:t>);</w:t>
+        <w:t>SELECT NOW();</w:t>
       </w:r>
     </w:p>
     <w:p>
       <w:r>
         <w:pict w14:anchorId="0E392D1F">
-          <v:rect id="_x0000_i1387" style="width:0;height:1.5pt" o:hralign="center" o:hrstd="t" o:hr="t" fillcolor="#a0a0a0" stroked="f"/>
+          <v:rect id="_x0000_i1069" style="width:0;height:1.5pt" o:hralign="center" o:hrstd="t" o:hr="t" fillcolor="#a0a0a0" stroked="f"/>
         </w:pict>
       </w:r>
     </w:p>
@@ -4468,21 +3634,13 @@
     </w:p>
     <w:p>
       <w:r>
-        <w:t xml:space="preserve">SELECT </w:t>
-      </w:r>
-      <w:proofErr w:type="gramStart"/>
-      <w:r>
-        <w:t>DATABASE(</w:t>
-      </w:r>
-      <w:proofErr w:type="gramEnd"/>
-      <w:r>
-        <w:t>);</w:t>
+        <w:t>SELECT DATABASE();</w:t>
       </w:r>
     </w:p>
     <w:p>
       <w:r>
         <w:pict w14:anchorId="4284A539">
-          <v:rect id="_x0000_i1388" style="width:0;height:1.5pt" o:hralign="center" o:hrstd="t" o:hr="t" fillcolor="#a0a0a0" stroked="f"/>
+          <v:rect id="_x0000_i1070" style="width:0;height:1.5pt" o:hralign="center" o:hrstd="t" o:hr="t" fillcolor="#a0a0a0" stroked="f"/>
         </w:pict>
       </w:r>
     </w:p>
@@ -4503,21 +3661,13 @@
     </w:p>
     <w:p>
       <w:r>
-        <w:t xml:space="preserve">SELECT </w:t>
-      </w:r>
-      <w:proofErr w:type="gramStart"/>
-      <w:r>
-        <w:t>USER(</w:t>
-      </w:r>
-      <w:proofErr w:type="gramEnd"/>
-      <w:r>
-        <w:t>);</w:t>
+        <w:t>SELECT USER();</w:t>
       </w:r>
     </w:p>
     <w:p>
       <w:r>
         <w:pict w14:anchorId="75C366ED">
-          <v:rect id="_x0000_i1389" style="width:0;height:1.5pt" o:hralign="center" o:hrstd="t" o:hr="t" fillcolor="#a0a0a0" stroked="f"/>
+          <v:rect id="_x0000_i1071" style="width:0;height:1.5pt" o:hralign="center" o:hrstd="t" o:hr="t" fillcolor="#a0a0a0" stroked="f"/>
         </w:pict>
       </w:r>
     </w:p>
@@ -4538,21 +3688,13 @@
     </w:p>
     <w:p>
       <w:r>
-        <w:t xml:space="preserve">SELECT </w:t>
-      </w:r>
-      <w:proofErr w:type="gramStart"/>
-      <w:r>
-        <w:t>VERSION(</w:t>
-      </w:r>
-      <w:proofErr w:type="gramEnd"/>
-      <w:r>
-        <w:t>);</w:t>
+        <w:t>SELECT VERSION();</w:t>
       </w:r>
     </w:p>
     <w:p>
       <w:r>
         <w:pict w14:anchorId="64508F87">
-          <v:rect id="_x0000_i1390" style="width:0;height:1.5pt" o:hralign="center" o:hrstd="t" o:hr="t" fillcolor="#a0a0a0" stroked="f"/>
+          <v:rect id="_x0000_i1072" style="width:0;height:1.5pt" o:hralign="center" o:hrstd="t" o:hr="t" fillcolor="#a0a0a0" stroked="f"/>
         </w:pict>
       </w:r>
     </w:p>
@@ -4573,21 +3715,13 @@
     </w:p>
     <w:p>
       <w:r>
-        <w:t xml:space="preserve">SELECT </w:t>
-      </w:r>
-      <w:proofErr w:type="gramStart"/>
-      <w:r>
-        <w:t>SYSDATE(</w:t>
-      </w:r>
-      <w:proofErr w:type="gramEnd"/>
-      <w:r>
-        <w:t>);</w:t>
+        <w:t>SELECT SYSDATE();</w:t>
       </w:r>
     </w:p>
     <w:p>
       <w:r>
         <w:pict w14:anchorId="019F0A95">
-          <v:rect id="_x0000_i1391" style="width:0;height:1.5pt" o:hralign="center" o:hrstd="t" o:hr="t" fillcolor="#a0a0a0" stroked="f"/>
+          <v:rect id="_x0000_i1073" style="width:0;height:1.5pt" o:hralign="center" o:hrstd="t" o:hr="t" fillcolor="#a0a0a0" stroked="f"/>
         </w:pict>
       </w:r>
     </w:p>
@@ -4608,21 +3742,13 @@
     </w:p>
     <w:p>
       <w:r>
-        <w:t>SELECT CONNECTION_</w:t>
-      </w:r>
-      <w:proofErr w:type="gramStart"/>
-      <w:r>
-        <w:t>ID(</w:t>
-      </w:r>
-      <w:proofErr w:type="gramEnd"/>
-      <w:r>
-        <w:t>);</w:t>
+        <w:t>SELECT CONNECTION_ID();</w:t>
       </w:r>
     </w:p>
     <w:p>
       <w:r>
         <w:pict w14:anchorId="4D65B61E">
-          <v:rect id="_x0000_i1392" style="width:0;height:1.5pt" o:hralign="center" o:hrstd="t" o:hr="t" fillcolor="#a0a0a0" stroked="f"/>
+          <v:rect id="_x0000_i1074" style="width:0;height:1.5pt" o:hralign="center" o:hrstd="t" o:hr="t" fillcolor="#a0a0a0" stroked="f"/>
         </w:pict>
       </w:r>
     </w:p>
@@ -4643,21 +3769,13 @@
     </w:p>
     <w:p>
       <w:r>
-        <w:t>SELECT CURRENT_</w:t>
-      </w:r>
-      <w:proofErr w:type="gramStart"/>
-      <w:r>
-        <w:t>USER(</w:t>
-      </w:r>
-      <w:proofErr w:type="gramEnd"/>
-      <w:r>
-        <w:t>);</w:t>
+        <w:t>SELECT CURRENT_USER();</w:t>
       </w:r>
     </w:p>
     <w:p>
       <w:r>
         <w:pict w14:anchorId="52087B62">
-          <v:rect id="_x0000_i1393" style="width:0;height:1.5pt" o:hralign="center" o:hrstd="t" o:hr="t" fillcolor="#a0a0a0" stroked="f"/>
+          <v:rect id="_x0000_i1075" style="width:0;height:1.5pt" o:hralign="center" o:hrstd="t" o:hr="t" fillcolor="#a0a0a0" stroked="f"/>
         </w:pict>
       </w:r>
     </w:p>
@@ -4678,18 +3796,13 @@
     </w:p>
     <w:p>
       <w:r>
-        <w:t>SELECT UTC_</w:t>
-      </w:r>
-      <w:proofErr w:type="gramStart"/>
-      <w:r>
-        <w:t>DATE();se</w:t>
-      </w:r>
-      <w:proofErr w:type="gramEnd"/>
+        <w:t>SELECT UTC_DATE();se</w:t>
+      </w:r>
     </w:p>
     <w:p>
       <w:r>
         <w:pict w14:anchorId="2A7245C8">
-          <v:rect id="_x0000_i1394" style="width:0;height:1.5pt" o:hralign="center" o:hrstd="t" o:hr="t" fillcolor="#a0a0a0" stroked="f"/>
+          <v:rect id="_x0000_i1076" style="width:0;height:1.5pt" o:hralign="center" o:hrstd="t" o:hr="t" fillcolor="#a0a0a0" stroked="f"/>
         </w:pict>
       </w:r>
     </w:p>
@@ -4710,21 +3823,13 @@
     </w:p>
     <w:p>
       <w:r>
-        <w:t>SELECT UTC_</w:t>
-      </w:r>
-      <w:proofErr w:type="gramStart"/>
-      <w:r>
-        <w:t>TIME(</w:t>
-      </w:r>
-      <w:proofErr w:type="gramEnd"/>
-      <w:r>
-        <w:t>);</w:t>
+        <w:t>SELECT UTC_TIME();</w:t>
       </w:r>
     </w:p>
     <w:p>
       <w:r>
         <w:pict w14:anchorId="7CEBC1B3">
-          <v:rect id="_x0000_i1395" style="width:0;height:1.5pt" o:hralign="center" o:hrstd="t" o:hr="t" fillcolor="#a0a0a0" stroked="f"/>
+          <v:rect id="_x0000_i1077" style="width:0;height:1.5pt" o:hralign="center" o:hrstd="t" o:hr="t" fillcolor="#a0a0a0" stroked="f"/>
         </w:pict>
       </w:r>
     </w:p>
@@ -4745,15 +3850,7 @@
     </w:p>
     <w:p>
       <w:r>
-        <w:t>SELECT UTC_</w:t>
-      </w:r>
-      <w:proofErr w:type="gramStart"/>
-      <w:r>
-        <w:t>TIMESTAMP(</w:t>
-      </w:r>
-      <w:proofErr w:type="gramEnd"/>
-      <w:r>
-        <w:t>);</w:t>
+        <w:t>SELECT UTC_TIMESTAMP();</w:t>
       </w:r>
     </w:p>
     <w:p>
@@ -5498,6 +4595,7 @@
   <w:style w:type="character" w:default="1" w:styleId="DefaultParagraphFont">
     <w:name w:val="Default Paragraph Font"/>
     <w:uiPriority w:val="1"/>
+    <w:semiHidden/>
     <w:unhideWhenUsed/>
   </w:style>
   <w:style w:type="table" w:default="1" w:styleId="TableNormal">

</xml_diff>